<commit_message>
Final reports as markdown and docx
</commit_message>
<xml_diff>
--- a/report/docs/final_report_findings.docx
+++ b/report/docs/final_report_findings.docx
@@ -54,7 +54,7 @@
         </w:numPr>
       </w:pPr>
       <w:r>
-        <w:t xml:space="preserve">Across 120 generated programs and 192 reviews, reviewers reported 1217 findings; 7 reviews had no findings.</w:t>
+        <w:t xml:space="preserve">The report contains 1217 reviewer-reported findings from 192 reviews of 120 generated programs; 7 reviews had no findings.</w:t>
       </w:r>
     </w:p>
     <w:p>
@@ -66,7 +66,7 @@
         </w:numPr>
       </w:pPr>
       <w:r>
-        <w:t xml:space="preserve">Self-reviews produced 300 findings in Basic, 315 in Security-aware, and 139 in Security-informed, with 6.25, 6.56, and 5.79 findings per review, respectively.</w:t>
+        <w:t xml:space="preserve">Basic self-reviews reported 300 findings, Security-aware self-reviews 315, and the Security-informed condition 602 across self-reviews and external reviews.</w:t>
       </w:r>
     </w:p>
     <w:p>
@@ -78,7 +78,7 @@
         </w:numPr>
       </w:pPr>
       <w:r>
-        <w:t xml:space="preserve">Across 48 matched Basic and Security-aware self-review pairs, the mean delta was 0.31 findings, with a CI from -0.29 to 0.94; 18 pairs had fewer findings, 23 had more, and 7 were ties.</w:t>
+        <w:t xml:space="preserve">Across 48 matched Basic and Security-aware self-review pairs, the mean delta was 0.31 findings per review, with a CI from -0.29 to 0.94; 23 pairs had more findings under Security-aware, 18 had fewer, and 7 were ties.</w:t>
       </w:r>
     </w:p>
     <w:p>
@@ -90,7 +90,7 @@
         </w:numPr>
       </w:pPr>
       <w:r>
-        <w:t xml:space="preserve">Sensitive data was the largest Security-informed rule grouping, with 339 findings (27.9%), followed by Authentication and access with 207 (17.0%); 159 findings (13.1%) were assigned no rule.</w:t>
+        <w:t xml:space="preserve">Sensitive data was the largest Security-informed rule grouping, with 339 findings and 27.9% of all findings; Authentication and access followed with 207 and 17.0%.</w:t>
       </w:r>
     </w:p>
     <w:p>
@@ -102,7 +102,7 @@
         </w:numPr>
       </w:pPr>
       <w:r>
-        <w:t xml:space="preserve">CWE-307 was the most-reported CWE with 90 findings (7.4%); the 14 most-reported CWEs together accounted for 51.9% of all reviewer-reported findings.</w:t>
+        <w:t xml:space="preserve">CWE-307 was the most-reported CWE, with 90 findings and 7.4% of all findings; the 14 most-reported CWEs together accounted for 51.9%.</w:t>
       </w:r>
     </w:p>
     <w:p>
@@ -114,7 +114,7 @@
         </w:numPr>
       </w:pPr>
       <w:r>
-        <w:t xml:space="preserve">Exact-CWE agreement was limited: 64.3% of 387 (program, category) pairs were named by one reviewer, while OWASP-category pairs were more often shared across reviewers.</w:t>
+        <w:t xml:space="preserve">Reviewer agreement was broader at the OWASP-category level than at the CWE-label level: 64.3% of CWE pairs were named by only 1 reviewer, compared with 32.1% of OWASP-category pairs.</w:t>
       </w:r>
     </w:p>
     <w:bookmarkEnd w:id="9"/>
@@ -735,7 +735,7 @@
         </w:r>
       </w:hyperlink>
       <w:r>
-        <w:t xml:space="preserve">, with 339 reviewer-reported findings (27.9%), followed by Authentication and access with 207 (17.0%). Findings assigned no rule numbered 159 (13.1%), while Identifiers and tokens was the smallest rule grouping with 60 (4.9%).</w:t>
+        <w:t xml:space="preserve">, with 339 reviewer-reported findings (27.9%), followed by Authentication and access with 207 (17.0%). Findings assigned no rule totaled 159 (13.1%), while Identifiers and tokens was the smallest listed grouping at 60 (4.9%).</w:t>
       </w:r>
     </w:p>
     <w:bookmarkEnd w:id="11"/>
@@ -1135,7 +1135,7 @@
         <w:t xml:space="preserve"> </w:t>
       </w:r>
       <w:r>
-        <w:t xml:space="preserve">contains 48 programs and 48 self-reviews each for Basic and Security-aware, and 24 programs, 24 self-reviews, and 72 external reviews for Security-informed. Reviewers reported 300, 315, and 602 findings in those conditions, respectively, with 0, 1, and 6 reviews having no findings.</w:t>
+        <w:t xml:space="preserve">records 48 programs and 48 self-reviews in each of the Basic and Security-aware conditions, compared with 24 programs, 24 self-reviews, and 72 external reviews in Security-informed. The conditions produced 300, 315, and 602 reviewer-reported findings respectively, with 0, 1, and 6 reviews reporting no findings.</w:t>
       </w:r>
     </w:p>
     <w:bookmarkEnd w:id="13"/>
@@ -1243,7 +1243,7 @@
         <w:t xml:space="preserve"> </w:t>
       </w:r>
       <w:r>
-        <w:t xml:space="preserve">shows uniform completed-review coverage across every task and generator within each condition. The Security-informed panel includes both self-review and external-review coverage, while the Basic and Security-aware panels contain self-reviews.</w:t>
+        <w:t xml:space="preserve">shows a uniform review count across every task–generator combination within each condition. Security-informed contains more completed reviews per combination because it includes the external reviews as well as self-review.</w:t>
       </w:r>
     </w:p>
     <w:bookmarkEnd w:id="18"/>
@@ -2201,7 +2201,7 @@
         </w:r>
       </w:hyperlink>
       <w:r>
-        <w:t xml:space="preserve">, Security-aware averaged 6.56 findings versus 6.25 for Basic, for a mean delta of 0.31 and a CI from -0.29 to 0.94; 18 pairs had fewer findings, 23 had more, and 7 tied. The agy mean delta was 1.08 with a CI from 0.17 to 1.92, whereas the codex mean delta was -0.75 with a CI from -1.67 to 0.17.</w:t>
+        <w:t xml:space="preserve">, Security-aware averaged 6.56 findings against 6.25 for Basic, a mean delta of 0.31 with a CI from -0.29 to 0.94; 23 pairs had more findings, 18 fewer, and 7 tied. The generator-level mean deltas were 1.08 for agy, 0.25 for claude, -0.75 for codex, and 0.67 for qwen.</w:t>
       </w:r>
     </w:p>
     <w:bookmarkEnd w:id="20"/>
@@ -2309,7 +2309,7 @@
         <w:t xml:space="preserve"> </w:t>
       </w:r>
       <w:r>
-        <w:t xml:space="preserve">shows matched-pair changes on both sides of zero for every generator. The mean marker is positive for agy, claude, and qwen, and negative for codex, with agy showing the clearest positive shift.</w:t>
+        <w:t xml:space="preserve">shows mixed pair-level changes for every generator rather than a uniform Security-aware shift. The mean marker is to the right of no change for agy, claude, and qwen, and to the left for codex, with observations on both sides for each generator.</w:t>
       </w:r>
     </w:p>
     <w:bookmarkEnd w:id="25"/>
@@ -2712,7 +2712,7 @@
         </w:r>
       </w:hyperlink>
       <w:r>
-        <w:t xml:space="preserve">, Basic, Security-aware, and Security-informed self-reviews had 6.25, 6.56, and 5.79 findings per review, with medians of 6.0, 7.0, and 7.0. Their High/Critical shares were 16.67%, 17.78%, and 14.39%, respectively; these are reviewer-reported findings rather than confirmed vulnerabilities.</w:t>
+        <w:t xml:space="preserve">, Security-aware had the highest findings per self-review at 6.56, followed by Basic at 6.25 and Security-informed at 5.79. Their medians were 7.0, 6.0, and 7.0 respectively, while the High/Critical shares were 17.78%, 16.67%, and 14.39%.</w:t>
       </w:r>
     </w:p>
     <w:bookmarkEnd w:id="27"/>
@@ -2820,7 +2820,7 @@
         <w:t xml:space="preserve"> </w:t>
       </w:r>
       <w:r>
-        <w:t xml:space="preserve">shows substantial overlap in findings per self-review across the three conditions. Security-aware and Security-informed share a higher median than Basic, while Security-informed has the lowest mean and a broad spread.</w:t>
+        <w:t xml:space="preserve">shows substantial overlap in findings per self-review across the three conditions. Security-aware has the broadest upper range, while the Security-informed distribution extends down to reviews with no findings.</w:t>
       </w:r>
     </w:p>
     <w:bookmarkEnd w:id="32"/>
@@ -2928,7 +2928,7 @@
         <w:t xml:space="preserve"> </w:t>
       </w:r>
       <w:r>
-        <w:t xml:space="preserve">shows that qwen has the highest self-review finding rate in Basic and Security-aware, while claude is highest in Security-informed. Codex has the lowest rate in every condition and declines from Basic to Security-informed.</w:t>
+        <w:t xml:space="preserve">shows that the condition pattern differs by generator: Security-aware is highest for agy and qwen, Security-informed is highest for claude, and Basic is highest for codex. Codex is lowest under Security-informed, whereas claude is highest in that condition.</w:t>
       </w:r>
     </w:p>
     <w:bookmarkEnd w:id="37"/>
@@ -3036,7 +3036,7 @@
         <w:t xml:space="preserve"> </w:t>
       </w:r>
       <w:r>
-        <w:t xml:space="preserve">shows that finding rates vary by task as well as condition. Security-informed is highest for the tasks anchored to CWE-321 and CWE-89, while Basic and Security-aware are higher for the tasks anchored to CWE-1004, CWE-307, and CWE-778.</w:t>
+        <w:t xml:space="preserve">shows different condition patterns across tasks: Security-informed is highest for the tasks anchored to CWE-321 and CWE-89, while Basic or Security-aware is higher for the other tasks. The tasks anchored to CWE-307 and CWE-778 have the highest rates under Basic and Security-aware, but both fall under Security-informed.</w:t>
       </w:r>
     </w:p>
     <w:bookmarkEnd w:id="42"/>
@@ -3132,6 +3132,12 @@
       <w:pPr>
         <w:pStyle w:val="BodyText"/>
       </w:pPr>
+      <w:r>
+        <w:t xml:space="preserve">Low and Medium findings make up most reviewer-reported findings in every condition in</w:t>
+      </w:r>
+      <w:r>
+        <w:t xml:space="preserve"> </w:t>
+      </w:r>
       <w:hyperlink w:anchor="fig-severity">
         <w:r>
           <w:rPr>
@@ -3141,10 +3147,7 @@
         </w:r>
       </w:hyperlink>
       <w:r>
-        <w:t xml:space="preserve"> </w:t>
-      </w:r>
-      <w:r>
-        <w:t xml:space="preserve">shows that Low and Medium findings make up most reviewer-reported findings in all three conditions. Security-informed has the largest Low share and the smallest combined High/Critical share, while Security-aware has the largest High share.</w:t>
+        <w:t xml:space="preserve">. Security-aware has the largest High share, while Security-informed has the largest Low share and is the only condition with a visible Other segment.</w:t>
       </w:r>
     </w:p>
     <w:bookmarkEnd w:id="47"/>
@@ -3252,7 +3255,7 @@
         <w:t xml:space="preserve"> </w:t>
       </w:r>
       <w:r>
-        <w:t xml:space="preserve">shows no self-reviews naming the anchor CWE for the tasks anchored to CWE-1004, CWE-321, CWE-89, or CWE-256. The anchor CWE is named most often for the CWE-307 task, especially under Basic, while the CWE-778 task has lower and more similar coverage across conditions.</w:t>
+        <w:t xml:space="preserve">shows no self-reviews naming the anchor CWE for the tasks anchored to CWE-1004, CWE-321, CWE-89, or CWE-256. Anchor naming appears only for the CWE-307 and CWE-778 tasks, and is most prominent for CWE-307 under Basic.</w:t>
       </w:r>
     </w:p>
     <w:bookmarkEnd w:id="52"/>
@@ -4331,7 +4334,7 @@
         <w:pStyle w:val="BodyText"/>
       </w:pPr>
       <w:r>
-        <w:t xml:space="preserve">CWE-307 ranks first in</w:t>
+        <w:t xml:space="preserve">CWE-307 led</w:t>
       </w:r>
       <w:r>
         <w:t xml:space="preserve"> </w:t>
@@ -4348,7 +4351,7 @@
         <w:t xml:space="preserve"> </w:t>
       </w:r>
       <w:r>
-        <w:t xml:space="preserve">with 90 findings (7.4%), followed by CWE-400 with 82; CWE-916 is third with 58. The 14 listed CWEs account for 51.9% of all reviewer-reported findings, with CWE-209 ranked 14th at 25 findings.</w:t>
+        <w:t xml:space="preserve">with 90 reviewer-reported findings (7.4%), followed by CWE-400 with 82; CWE-916 was third with 58. The 14 listed CWEs accounted cumulatively for 51.9% of all findings.</w:t>
       </w:r>
     </w:p>
     <w:bookmarkEnd w:id="54"/>
@@ -4456,7 +4459,7 @@
         <w:t xml:space="preserve"> </w:t>
       </w:r>
       <w:r>
-        <w:t xml:space="preserve">shows different condition profiles among the most-reported CWEs. Security-informed is highest for CWE-307, CWE-400, CWE-770, and CWE-367, but lowest for several others, including CWE-521, CWE-362, CWE-532, CWE-798, CWE-204, and CWE-209.</w:t>
+        <w:t xml:space="preserve">shows CWE-307 and CWE-400 among the highest-rate labels across conditions. Security-informed is relatively higher for CWE-400, CWE-770, and CWE-367, but lower for CWE-521, CWE-362, CWE-532, CWE-798, CWE-204, and CWE-209.</w:t>
       </w:r>
     </w:p>
     <w:bookmarkEnd w:id="59"/>
@@ -5401,7 +5404,7 @@
         </w:r>
       </w:hyperlink>
       <w:r>
-        <w:t xml:space="preserve">, CWE-307 is similar across conditions at 0.48, 0.48, and 0.5 findings per review, while CWE-400 rises from 0.35 and 0.31 to 0.5 in Security-informed. Security-informed is also higher for CWE-770 at 0.21 and CWE-367 at 0.29, but records 0.0 for CWE-798 and CWE-204.</w:t>
+        <w:t xml:space="preserve">, CWE-307 rates are similar across conditions at 0.48, 0.48, and 0.5, while CWE-400 rises to 0.5 in Security-informed from 0.35 in Basic and 0.31 in Security-aware. Security-informed reports 0.0 for CWE-798 and CWE-204, and its Other rate of 3.12 is the table’s largest Other value.</w:t>
       </w:r>
     </w:p>
     <w:bookmarkEnd w:id="61"/>
@@ -5509,7 +5512,7 @@
         <w:t xml:space="preserve"> </w:t>
       </w:r>
       <w:r>
-        <w:t xml:space="preserve">shows A07 as the highest mapped OWASP category in each condition, although its rate declines from Basic through Security-informed. Unmapped CWEs have the highest overall rate in Security-aware and Security-informed, while A04 and A05 rise across the three conditions.</w:t>
+        <w:t xml:space="preserve">shows A07 as the highest mapped OWASP-category rate in all three conditions, while the unmapped group is higher still for Security-aware and Security-informed. A04 and A05 rise from Basic to Security-informed, whereas A01, A02, A06, A07, and A08 decline.</w:t>
       </w:r>
     </w:p>
     <w:bookmarkEnd w:id="66"/>
@@ -6222,6 +6225,12 @@
       <w:pPr>
         <w:pStyle w:val="BodyText"/>
       </w:pPr>
+      <w:r>
+        <w:t xml:space="preserve">In</w:t>
+      </w:r>
+      <w:r>
+        <w:t xml:space="preserve"> </w:t>
+      </w:r>
       <w:hyperlink w:anchor="tbl-owasp-rates">
         <w:r>
           <w:rPr>
@@ -6231,10 +6240,7 @@
         </w:r>
       </w:hyperlink>
       <w:r>
-        <w:t xml:space="preserve"> </w:t>
-      </w:r>
-      <w:r>
-        <w:t xml:space="preserve">shows A07 at 1.75, 1.38, and 1.04 findings per review for Basic, Security-aware, and Security-informed, while unmapped CWEs are 1.48, 1.92, and 1.92. A04 increases from 0.52 to 0.69 to 0.79, whereas A01 is 0.77, 0.83, and 0.54.</w:t>
+        <w:t xml:space="preserve">, A07 is the highest mapped category in every condition, at 1.75 for Basic, 1.38 for Security-aware, and 1.04 for Security-informed. The unmapped rate is 1.48, 1.92, and 1.92 respectively; A04 rises from 0.52 to 0.69 to 0.79, while A03 is 0.02, 0.0, and 0.0.</w:t>
       </w:r>
     </w:p>
     <w:bookmarkEnd w:id="68"/>
@@ -6342,7 +6348,7 @@
         <w:t xml:space="preserve"> </w:t>
       </w:r>
       <w:r>
-        <w:t xml:space="preserve">shows that the combined Other CWEs form the largest share in every condition and are most prominent in Security-informed. Among the individually displayed CWEs, Security-informed gives relatively greater shares to CWE-307, CWE-400, CWE-770, and CWE-367, while CWE-521 is less prominent.</w:t>
+        <w:t xml:space="preserve">shows that Other CWEs form the largest share in every condition and are most prominent in Security-informed. Among the named labels, Security-informed has visibly larger shares for CWE-400 and CWE-367 and a smaller share for CWE-521 than the other conditions.</w:t>
       </w:r>
     </w:p>
     <w:bookmarkEnd w:id="73"/>
@@ -6438,6 +6444,12 @@
       <w:pPr>
         <w:pStyle w:val="BodyText"/>
       </w:pPr>
+      <w:r>
+        <w:t xml:space="preserve">The unmapped group is the largest segment under Security-aware and Security-informed in</w:t>
+      </w:r>
+      <w:r>
+        <w:t xml:space="preserve"> </w:t>
+      </w:r>
       <w:hyperlink w:anchor="fig-owasp-mix">
         <w:r>
           <w:rPr>
@@ -6447,10 +6459,7 @@
         </w:r>
       </w:hyperlink>
       <w:r>
-        <w:t xml:space="preserve"> </w:t>
-      </w:r>
-      <w:r>
-        <w:t xml:space="preserve">shows unmapped CWEs taking a progressively larger share from Basic to Security-informed, while A07 takes a progressively smaller share. A04 also occupies a larger share in Security-informed than in the other conditions.</w:t>
+        <w:t xml:space="preserve">, while A07 is the largest mapped segment in every condition. Security-informed shows a larger A04 share and smaller A01, A06, and A07 shares than Basic.</w:t>
       </w:r>
     </w:p>
     <w:bookmarkEnd w:id="78"/>
@@ -6558,7 +6567,7 @@
         <w:t xml:space="preserve"> </w:t>
       </w:r>
       <w:r>
-        <w:t xml:space="preserve">shows substantial variation in CWE composition across both generators and conditions. Other CWEs dominate most panels, while codex Security-informed is notably concentrated in CWE-307 and agy Security-informed gives the largest named slice to CWE-400.</w:t>
+        <w:t xml:space="preserve">shows substantial variation in CWE composition by generator and condition. Other CWEs dominate most panels, while codex’s Security-informed panel is concentrated in CWE-307 and agy’s corresponding panel gives greater prominence to CWE-400.</w:t>
       </w:r>
     </w:p>
     <w:bookmarkEnd w:id="83"/>
@@ -6666,7 +6675,7 @@
         <w:t xml:space="preserve"> </w:t>
       </w:r>
       <w:r>
-        <w:t xml:space="preserve">shows that A07 and unmapped CWEs are the dominant portions in most generator-condition combinations. The Security-informed mixes differ visibly by generator: codex is concentrated in A07, claude has a comparatively large A04 share, and agy and qwen are led by unmapped CWEs.</w:t>
+        <w:t xml:space="preserve">shows that A07 or the unmapped group is the largest segment in most generator–condition panels. A07 is especially prominent for codex under Security-informed, while the unmapped share is largest for agy and qwen in that condition.</w:t>
       </w:r>
     </w:p>
     <w:bookmarkEnd w:id="88"/>
@@ -6774,7 +6783,7 @@
         <w:t xml:space="preserve"> </w:t>
       </w:r>
       <w:r>
-        <w:t xml:space="preserve">shows Sensitive data as the highest-rate rule grouping in every condition. Security-informed is higher for Trust boundaries, Identifiers and tokens, Concurrency, and No rule, but lower for Secrets, Authentication and access, Failure behaviour, and Prefer the platform.</w:t>
+        <w:t xml:space="preserve">shows Sensitive data as the highest-rate rule group under all conditions. Security-informed is lower for Secrets, Authentication and access, and Failure behaviour, but higher for Trust boundaries, Concurrency, and No rule.</w:t>
       </w:r>
     </w:p>
     <w:bookmarkEnd w:id="93"/>
@@ -7380,7 +7389,7 @@
         <w:pStyle w:val="BodyText"/>
       </w:pPr>
       <w:r>
-        <w:t xml:space="preserve">In</w:t>
+        <w:t xml:space="preserve">Sensitive data has the highest rate in every condition in</w:t>
       </w:r>
       <w:r>
         <w:t xml:space="preserve"> </w:t>
@@ -7394,7 +7403,7 @@
         </w:r>
       </w:hyperlink>
       <w:r>
-        <w:t xml:space="preserve">, Sensitive data has 1.58, 1.77, and 1.75 findings per review across Basic, Security-aware, and Security-informed. Security-informed is much lower for Secrets at 0.17 versus 0.73 in both other conditions, while No rule rises from 0.54 to 0.73 to 0.92.</w:t>
+        <w:t xml:space="preserve">: 1.58 for Basic, 1.77 for Security-aware, and 1.75 for Security-informed. Security-informed is lowest for Secrets at 0.17 and highest for No rule at 0.92; Authentication and access declines from 1.25 to 1.1 to 0.88.</w:t>
       </w:r>
     </w:p>
     <w:bookmarkEnd w:id="95"/>
@@ -7490,6 +7499,12 @@
       <w:pPr>
         <w:pStyle w:val="BodyText"/>
       </w:pPr>
+      <w:r>
+        <w:t xml:space="preserve">Sensitive data is the largest rule share in every condition in</w:t>
+      </w:r>
+      <w:r>
+        <w:t xml:space="preserve"> </w:t>
+      </w:r>
       <w:hyperlink w:anchor="fig-rule-mix">
         <w:r>
           <w:rPr>
@@ -7499,10 +7514,7 @@
         </w:r>
       </w:hyperlink>
       <w:r>
-        <w:t xml:space="preserve"> </w:t>
-      </w:r>
-      <w:r>
-        <w:t xml:space="preserve">shows Sensitive data as the largest share in all three conditions. Security-informed has larger shares for Trust boundaries, Identifiers and tokens, Concurrency, and No rule, alongside smaller shares for Secrets, Authentication and access, Failure behaviour, and Prefer the platform.</w:t>
+        <w:t xml:space="preserve">. Security-informed assigns visibly smaller shares to Secrets and Failure behaviour and larger shares to Trust boundaries, Concurrency, and No rule than the other conditions.</w:t>
       </w:r>
     </w:p>
     <w:bookmarkEnd w:id="100"/>
@@ -7610,7 +7622,7 @@
         <w:t xml:space="preserve"> </w:t>
       </w:r>
       <w:r>
-        <w:t xml:space="preserve">shows that reviewer identity and generator identity both correspond to large differences in findings per review. Every reviewer reports the highest rate on agy-generated programs and a lower rate on codex-generated programs, with self-review cells especially low for codex and comparatively high for agy.</w:t>
+        <w:t xml:space="preserve">shows that all reviewers report more findings on agy-generated programs than on codex-generated programs. Relative to each reviewer’s own mean, agy is above average for every reviewer, while codex is below average for every reviewer and especially low in codex and qwen reviews.</w:t>
       </w:r>
     </w:p>
     <w:bookmarkEnd w:id="105"/>
@@ -8210,6 +8222,12 @@
       <w:pPr>
         <w:pStyle w:val="BodyText"/>
       </w:pPr>
+      <w:r>
+        <w:t xml:space="preserve">Claude reported the most findings per review in</w:t>
+      </w:r>
+      <w:r>
+        <w:t xml:space="preserve"> </w:t>
+      </w:r>
       <w:hyperlink w:anchor="tbl-behaviour">
         <w:r>
           <w:rPr>
@@ -8222,7 +8240,7 @@
         <w:t xml:space="preserve"> </w:t>
       </w:r>
       <w:r>
-        <w:t xml:space="preserve">shows claude with the highest volume at 7.83 findings per review and agy with the highest High/Critical share at 29.31%; qwen reports the most distinct CWEs at 68. Codex reports 2.0 findings per review on its own code versus 6.39 on other code, an other-minus-own difference of 4.39, while agy shows -2.44.</w:t>
+        <w:t xml:space="preserve">at 7.83, while agy reported the highest High/Critical share at 29.31% and qwen the most distinct CWEs at 68. Codex showed the largest own-code contrast: 2.0 findings per review on own code versus 6.39 on other code, an other-minus-own difference of 4.39.</w:t>
       </w:r>
     </w:p>
     <w:bookmarkEnd w:id="107"/>
@@ -8330,7 +8348,7 @@
         <w:t xml:space="preserve"> </w:t>
       </w:r>
       <w:r>
-        <w:t xml:space="preserve">separates the reviewers on both volume and severity: claude has the highest finding volume but the lowest High/Critical share, whereas agy has the lowest volume and highest High/Critical share. Codex reports markedly more findings on other generators’ code than on its own, while agy shows the reverse pattern.</w:t>
+        <w:t xml:space="preserve">separates reviewer volume from severity: claude has the highest finding volume but the lowest High/Critical share, while agy shows the reverse pattern. Agy and claude report fewer findings on other generators’ code than on their own, whereas codex and qwen report more.</w:t>
       </w:r>
     </w:p>
     <w:bookmarkEnd w:id="112"/>
@@ -8438,7 +8456,7 @@
         <w:t xml:space="preserve"> </w:t>
       </w:r>
       <w:r>
-        <w:t xml:space="preserve">shows distinct severity profiles by reviewer. Agy has the largest High share, codex is dominated by Medium findings, and claude and qwen have comparatively large Low shares; Critical findings are only thin slivers where present.</w:t>
+        <w:t xml:space="preserve">shows distinct severity mixes by reviewer. Agy has the largest High share, codex is dominated by Medium findings, claude has the largest Low share, and qwen alone has a clearly visible Other segment.</w:t>
       </w:r>
     </w:p>
     <w:bookmarkEnd w:id="117"/>
@@ -8546,7 +8564,7 @@
         <w:t xml:space="preserve"> </w:t>
       </w:r>
       <w:r>
-        <w:t xml:space="preserve">shows that most exact CWE labels on a program are named by only one reviewer, with progressively fewer shared by two, three, or four reviewers. OWASP categories show broader agreement, with two-reviewer matches the largest group and visibly more three- and four-reviewer matches than for exact CWE labels.</w:t>
+        <w:t xml:space="preserve">shows that CWE labels are most often named by only one reviewer on a program, with progressively fewer pairs shared by additional reviewers. OWASP-category agreement is broader: naming by two reviewers is most common, and three- and four-reviewer agreement is more visible than for CWE labels.</w:t>
       </w:r>
     </w:p>
     <w:bookmarkEnd w:id="122"/>
@@ -8855,7 +8873,7 @@
         <w:pStyle w:val="BodyText"/>
       </w:pPr>
       <w:r>
-        <w:t xml:space="preserve">For the 387 CWE-label pairs in</w:t>
+        <w:t xml:space="preserve">At the CWE-label level in</w:t>
       </w:r>
       <w:r>
         <w:t xml:space="preserve"> </w:t>
@@ -8869,7 +8887,7 @@
         </w:r>
       </w:hyperlink>
       <w:r>
-        <w:t xml:space="preserve">, 64.3% were named by 1 reviewer, 27.1% by 2, 7.2% by 3, and 1.3% by all 4. Among 137 OWASP-category pairs, the corresponding shares were 32.1%, 35.8%, 21.2%, and 10.9%.</w:t>
+        <w:t xml:space="preserve">, 64.3% of 387 pairs were named by 1 reviewer, 27.1% by 2, 7.2% by 3, and 1.3% by all 4. For the 137 OWASP-category pairs, the corresponding shares were 32.1%, 35.8%, 21.2%, and 10.9%.</w:t>
       </w:r>
     </w:p>
     <w:bookmarkEnd w:id="124"/>
@@ -9232,7 +9250,7 @@
         <w:t xml:space="preserve"> </w:t>
       </w:r>
       <w:r>
-        <w:t xml:space="preserve">shows low mean overlap for exact CWE labels, ranging from 0.1 for agy / qwen to 0.22 for claude / codex. OWASP overlap is higher for every pair, led by claude / qwen at 0.54 and lowest for agy / codex at 0.26.</w:t>
+        <w:t xml:space="preserve">reports low mean pairwise overlap at the CWE level, ranging from 0.1 for agy / qwen to 0.22 for claude / codex. OWASP overlap is higher for every pair, led by claude / qwen at 0.54 and lowest for agy / codex at 0.26.</w:t>
       </w:r>
     </w:p>
     <w:bookmarkEnd w:id="126"/>
@@ -9340,7 +9358,7 @@
         <w:t xml:space="preserve"> </w:t>
       </w:r>
       <w:r>
-        <w:t xml:space="preserve">shows that Security-informed CWE composition differs between self-review and external review for every generator. External reviews are generally spread across more named CWE slices; the Other share decreases for agy and claude but increases markedly for codex, while qwen remains led by Other in both review types.</w:t>
+        <w:t xml:space="preserve">shows that external-review CWE mixes are generally more dispersed than self-review mixes. The largest named external-review label differs by generator: CWE-770 for agy, CWE-367 for claude, CWE-307 for codex, and CWE-400 for qwen.</w:t>
       </w:r>
     </w:p>
     <w:bookmarkEnd w:id="131"/>
@@ -9436,6 +9454,12 @@
       <w:pPr>
         <w:pStyle w:val="BodyText"/>
       </w:pPr>
+      <w:r>
+        <w:t xml:space="preserve">In</w:t>
+      </w:r>
+      <w:r>
+        <w:t xml:space="preserve"> </w:t>
+      </w:r>
       <w:hyperlink w:anchor="fig-owasp-pies-2">
         <w:r>
           <w:rPr>
@@ -9445,10 +9469,7 @@
         </w:r>
       </w:hyperlink>
       <w:r>
-        <w:t xml:space="preserve"> </w:t>
-      </w:r>
-      <w:r>
-        <w:t xml:space="preserve">shows broadly similar leading OWASP groupings between Security-informed self-review and external review, but with generator-specific shifts. Unmapped CWEs lead most panels, while codex self-review is led by A07 and its external-review mix shifts toward unmapped CWEs and A09.</w:t>
+        <w:t xml:space="preserve">, the unmapped group is the largest segment for every generator’s external reviews. Compared with self-review, external reviews are less concentrated in A07 for codex and show a larger A06 share for agy and qwen.</w:t>
       </w:r>
     </w:p>
     <w:bookmarkEnd w:id="136"/>
@@ -9556,7 +9577,7 @@
         <w:t xml:space="preserve"> </w:t>
       </w:r>
       <w:r>
-        <w:t xml:space="preserve">shows distinct CWE profiles across tasks rather than a single dominant pattern. CWE-307 is most prominent on the later tasks, CWE-732 peaks on the CWE-778 task, and the combined Other group is largest on the CWE-1004 task.</w:t>
+        <w:t xml:space="preserve">shows that the Other group is the largest rate for every task. Among named CWEs, CWE-307 is strongest on the tasks anchored to CWE-1004, CWE-256, CWE-307, and CWE-778, while CWE-732 reaches its highest rates on the tasks anchored to CWE-321 and CWE-778.</w:t>
       </w:r>
     </w:p>
     <w:bookmarkEnd w:id="141"/>
@@ -9664,7 +9685,7 @@
         <w:t xml:space="preserve"> </w:t>
       </w:r>
       <w:r>
-        <w:t xml:space="preserve">shows A07 and unmapped CWEs as the largest categories across most tasks. A01 is most prominent on the CWE-321 task, A04 on the CWE-1004 task, and A06 on the CWE-778 task.</w:t>
+        <w:t xml:space="preserve">shows the unmapped group as the highest rate for every task except the task anchored to CWE-1004, where A07 is highest. A07 is also the leading mapped category for most tasks, while A01 leads among mapped categories for the task anchored to CWE-321.</w:t>
       </w:r>
     </w:p>
     <w:bookmarkEnd w:id="146"/>
@@ -10075,7 +10096,7 @@
         <w:t xml:space="preserve"> </w:t>
       </w:r>
       <w:r>
-        <w:t xml:space="preserve">records 1224 CSV rows representing 1217 findings across 192 reviews and 120 generated programs; 7 reviews had no findings. All 24 Security-informed programs were read by all 4 reviewers, with 0 rows missing reviewer or generator, 0 duplicate rows, 0 findings without a CWE, 8 findings with non-standard severity, and 0 repeated sec_id values within a review.</w:t>
+        <w:t xml:space="preserve">records 1224 CSV rows, 1217 reviewer-reported findings, 192 reviews, and 120 generated programs, with 7 reviews reporting no findings. It also shows 0 rows missing reviewer or generator, 0 duplicate rows, 0 findings with no CWE, 8 findings with non-standard severity, and 0 repeated sec_id values within a review.</w:t>
       </w:r>
     </w:p>
     <w:bookmarkEnd w:id="148"/>

</xml_diff>

<commit_message>
Add setup script, README and robust report generation
</commit_message>
<xml_diff>
--- a/report/docs/final_report_findings.docx
+++ b/report/docs/final_report_findings.docx
@@ -54,7 +54,7 @@
         </w:numPr>
       </w:pPr>
       <w:r>
-        <w:t xml:space="preserve">The report contains 1217 reviewer-reported findings from 192 reviews of 120 generated programs; 7 reviews had no findings.</w:t>
+        <w:t xml:space="preserve">The report contains 1,217 reviewer-reported findings across 192 reviews of 120 generated programs; these are findings reported by LLM reviewers, not confirmed vulnerabilities.</w:t>
       </w:r>
     </w:p>
     <w:p>
@@ -66,7 +66,7 @@
         </w:numPr>
       </w:pPr>
       <w:r>
-        <w:t xml:space="preserve">Basic self-reviews reported 300 findings, Security-aware self-reviews 315, and the Security-informed condition 602 across self-reviews and external reviews.</w:t>
+        <w:t xml:space="preserve">Self-reviews produced 300 findings for Basic, 315 for Security-aware, and 139 for Security-informed, with 6.25, 6.56, and 5.79 findings per review, respectively.</w:t>
       </w:r>
     </w:p>
     <w:p>
@@ -78,7 +78,7 @@
         </w:numPr>
       </w:pPr>
       <w:r>
-        <w:t xml:space="preserve">Across 48 matched Basic and Security-aware self-review pairs, the mean delta was 0.31 findings per review, with a CI from -0.29 to 0.94; 23 pairs had more findings under Security-aware, 18 had fewer, and 7 were ties.</w:t>
+        <w:t xml:space="preserve">In the 48 matched Basic and Security-aware self-review pairs, Security-aware had a mean delta of 0.31 findings, with 23 pairs reporting more, 18 fewer, and 7 tied.</w:t>
       </w:r>
     </w:p>
     <w:p>
@@ -102,7 +102,7 @@
         </w:numPr>
       </w:pPr>
       <w:r>
-        <w:t xml:space="preserve">CWE-307 was the most-reported CWE, with 90 findings and 7.4% of all findings; the 14 most-reported CWEs together accounted for 51.9%.</w:t>
+        <w:t xml:space="preserve">CWE-307 was the most-reported CWE with 90 findings, while the 14 leading CWEs together accounted for 51.9% of all findings.</w:t>
       </w:r>
     </w:p>
     <w:p>
@@ -114,7 +114,7 @@
         </w:numPr>
       </w:pPr>
       <w:r>
-        <w:t xml:space="preserve">Reviewer agreement was broader at the OWASP-category level than at the CWE-label level: 64.3% of CWE pairs were named by only 1 reviewer, compared with 32.1% of OWASP-category pairs.</w:t>
+        <w:t xml:space="preserve">Reviewer agreement was greater at the OWASP-category level than at the CWE-label level: 10.9% of OWASP pairs, versus 1.3% of CWE pairs, were named by all 4 reviewers.</w:t>
       </w:r>
     </w:p>
     <w:bookmarkEnd w:id="9"/>
@@ -721,7 +721,7 @@
         <w:pStyle w:val="BodyText"/>
       </w:pPr>
       <w:r>
-        <w:t xml:space="preserve">Sensitive data was the largest rule grouping in</w:t>
+        <w:t xml:space="preserve">Among the eight rule groupings in</w:t>
       </w:r>
       <w:r>
         <w:t xml:space="preserve"> </w:t>
@@ -735,7 +735,7 @@
         </w:r>
       </w:hyperlink>
       <w:r>
-        <w:t xml:space="preserve">, with 339 reviewer-reported findings (27.9%), followed by Authentication and access with 207 (17.0%). Findings assigned no rule totaled 159 (13.1%), while Identifiers and tokens was the smallest listed grouping at 60 (4.9%).</w:t>
+        <w:t xml:space="preserve">, Sensitive data is largest with 339 reviewer-reported findings (27.9%), followed by Authentication and access with 207 (17.0%). A further 159 findings (13.1%) are assigned to no rule.</w:t>
       </w:r>
     </w:p>
     <w:bookmarkEnd w:id="11"/>
@@ -1135,7 +1135,7 @@
         <w:t xml:space="preserve"> </w:t>
       </w:r>
       <w:r>
-        <w:t xml:space="preserve">records 48 programs and 48 self-reviews in each of the Basic and Security-aware conditions, compared with 24 programs, 24 self-reviews, and 72 external reviews in Security-informed. The conditions produced 300, 315, and 602 reviewer-reported findings respectively, with 0, 1, and 6 reviews reporting no findings.</w:t>
+        <w:t xml:space="preserve">covers 120 programs and 192 reviews: 48 Basic self-reviews, 48 Security-aware self-reviews, and 24 Security-informed self-reviews plus 72 external reviews. These reviews yielded 300, 315, and 602 reviewer-reported findings, respectively, while 7 reviews had no findings.</w:t>
       </w:r>
     </w:p>
     <w:bookmarkEnd w:id="13"/>
@@ -1243,7 +1243,7 @@
         <w:t xml:space="preserve"> </w:t>
       </w:r>
       <w:r>
-        <w:t xml:space="preserve">shows a uniform review count across every task–generator combination within each condition. Security-informed contains more completed reviews per combination because it includes the external reviews as well as self-review.</w:t>
+        <w:t xml:space="preserve">shows uniform completed-review coverage across every task and generator within each condition. Security-informed has more completed reviews in each cell because it includes both self-review and external review.</w:t>
       </w:r>
     </w:p>
     <w:bookmarkEnd w:id="18"/>
@@ -2187,7 +2187,7 @@
         <w:pStyle w:val="BodyText"/>
       </w:pPr>
       <w:r>
-        <w:t xml:space="preserve">Across all 48 matched pairs in</w:t>
+        <w:t xml:space="preserve">Across 48 matched pairs in</w:t>
       </w:r>
       <w:r>
         <w:t xml:space="preserve"> </w:t>
@@ -2201,7 +2201,7 @@
         </w:r>
       </w:hyperlink>
       <w:r>
-        <w:t xml:space="preserve">, Security-aware averaged 6.56 findings against 6.25 for Basic, a mean delta of 0.31 with a CI from -0.29 to 0.94; 23 pairs had more findings, 18 fewer, and 7 tied. The generator-level mean deltas were 1.08 for agy, 0.25 for claude, -0.75 for codex, and 0.67 for qwen.</w:t>
+        <w:t xml:space="preserve">, Security-aware averaged 6.56 findings against 6.25 for Basic, a mean delta of 0.31; 23 pairs had more findings, 18 fewer, and 7 tied. The generator-level mean delta was positive for agy (1.08), claude (0.25), and qwen (0.67), but negative for codex (-0.75).</w:t>
       </w:r>
     </w:p>
     <w:bookmarkEnd w:id="20"/>
@@ -2309,7 +2309,7 @@
         <w:t xml:space="preserve"> </w:t>
       </w:r>
       <w:r>
-        <w:t xml:space="preserve">shows mixed pair-level changes for every generator rather than a uniform Security-aware shift. The mean marker is to the right of no change for agy, claude, and qwen, and to the left for codex, with observations on both sides for each generator.</w:t>
+        <w:t xml:space="preserve">shows mostly positive paired differences for agy, mostly negative differences for codex, and more mixed results for claude and qwen. The individual pairs vary substantially within every generator.</w:t>
       </w:r>
     </w:p>
     <w:bookmarkEnd w:id="25"/>
@@ -2712,7 +2712,7 @@
         </w:r>
       </w:hyperlink>
       <w:r>
-        <w:t xml:space="preserve">, Security-aware had the highest findings per self-review at 6.56, followed by Basic at 6.25 and Security-informed at 5.79. Their medians were 7.0, 6.0, and 7.0 respectively, while the High/Critical shares were 17.78%, 16.67%, and 14.39%.</w:t>
+        <w:t xml:space="preserve">, Security-aware has the highest findings per review at 6.56, compared with 6.25 for Basic and 5.79 for Security-informed. The median is 6.0 for Basic and 7.0 for both security conditions, while the High/Critical share is 16.67%, 17.78%, and 14.39%, respectively.</w:t>
       </w:r>
     </w:p>
     <w:bookmarkEnd w:id="27"/>
@@ -2820,7 +2820,7 @@
         <w:t xml:space="preserve"> </w:t>
       </w:r>
       <w:r>
-        <w:t xml:space="preserve">shows substantial overlap in findings per self-review across the three conditions. Security-aware has the broadest upper range, while the Security-informed distribution extends down to reviews with no findings.</w:t>
+        <w:t xml:space="preserve">shows broad, overlapping distributions of findings per self-review across all three conditions. Security-aware extends across the widest range, while Security-informed has fewer observations and a similarly broad spread.</w:t>
       </w:r>
     </w:p>
     <w:bookmarkEnd w:id="32"/>
@@ -2928,7 +2928,7 @@
         <w:t xml:space="preserve"> </w:t>
       </w:r>
       <w:r>
-        <w:t xml:space="preserve">shows that the condition pattern differs by generator: Security-aware is highest for agy and qwen, Security-informed is highest for claude, and Basic is highest for codex. Codex is lowest under Security-informed, whereas claude is highest in that condition.</w:t>
+        <w:t xml:space="preserve">shows that the condition pattern differs by generator: qwen is highest under Basic and Security-aware, whereas claude is highest under Security-informed. Codex is lowest in every condition and declines across the three conditions.</w:t>
       </w:r>
     </w:p>
     <w:bookmarkEnd w:id="37"/>
@@ -3036,7 +3036,7 @@
         <w:t xml:space="preserve"> </w:t>
       </w:r>
       <w:r>
-        <w:t xml:space="preserve">shows different condition patterns across tasks: Security-informed is highest for the tasks anchored to CWE-321 and CWE-89, while Basic or Security-aware is higher for the other tasks. The tasks anchored to CWE-307 and CWE-778 have the highest rates under Basic and Security-aware, but both fall under Security-informed.</w:t>
+        <w:t xml:space="preserve">shows marked task differences: Tasks 5 and 6 are highest under Basic and Security-aware, while Security-informed is highest for Task 3. Security-informed is lower than both other conditions on Tasks 1, 5, and 6, but higher on Tasks 2 and 3.</w:t>
       </w:r>
     </w:p>
     <w:bookmarkEnd w:id="42"/>
@@ -3147,7 +3147,7 @@
         </w:r>
       </w:hyperlink>
       <w:r>
-        <w:t xml:space="preserve">. Security-aware has the largest High share, while Security-informed has the largest Low share and is the only condition with a visible Other segment.</w:t>
+        <w:t xml:space="preserve">. Security-informed has the largest Low share and the smallest High/Critical share, while Critical and Other findings occupy only small portions of the bars.</w:t>
       </w:r>
     </w:p>
     <w:bookmarkEnd w:id="47"/>
@@ -3243,6 +3243,12 @@
       <w:pPr>
         <w:pStyle w:val="BodyText"/>
       </w:pPr>
+      <w:r>
+        <w:t xml:space="preserve">In</w:t>
+      </w:r>
+      <w:r>
+        <w:t xml:space="preserve"> </w:t>
+      </w:r>
       <w:hyperlink w:anchor="fig-anchor">
         <w:r>
           <w:rPr>
@@ -3252,10 +3258,7 @@
         </w:r>
       </w:hyperlink>
       <w:r>
-        <w:t xml:space="preserve"> </w:t>
-      </w:r>
-      <w:r>
-        <w:t xml:space="preserve">shows no self-reviews naming the anchor CWE for the tasks anchored to CWE-1004, CWE-321, CWE-89, or CWE-256. Anchor naming appears only for the CWE-307 and CWE-778 tasks, and is most prominent for CWE-307 under Basic.</w:t>
+        <w:t xml:space="preserve">, reviewers name the task’s anchor CWE only for Tasks 5 and 6; none of the self-reviews name the anchor for Tasks 1 through 4. Task 5 is named most often under Basic, while Task 6 is named less often and varies less across conditions.</w:t>
       </w:r>
     </w:p>
     <w:bookmarkEnd w:id="52"/>
@@ -4333,12 +4336,6 @@
       <w:pPr>
         <w:pStyle w:val="BodyText"/>
       </w:pPr>
-      <w:r>
-        <w:t xml:space="preserve">CWE-307 led</w:t>
-      </w:r>
-      <w:r>
-        <w:t xml:space="preserve"> </w:t>
-      </w:r>
       <w:hyperlink w:anchor="tbl-top-cwes">
         <w:r>
           <w:rPr>
@@ -4351,7 +4348,7 @@
         <w:t xml:space="preserve"> </w:t>
       </w:r>
       <w:r>
-        <w:t xml:space="preserve">with 90 reviewer-reported findings (7.4%), followed by CWE-400 with 82; CWE-916 was third with 58. The 14 listed CWEs accounted cumulatively for 51.9% of all findings.</w:t>
+        <w:t xml:space="preserve">ranks CWE-307 first with 90 reviewer-reported findings, followed by CWE-400 with 82 and CWE-916 with 58. The 14 listed CWEs account cumulatively for 51.9% of all findings.</w:t>
       </w:r>
     </w:p>
     <w:bookmarkEnd w:id="54"/>
@@ -4459,7 +4456,7 @@
         <w:t xml:space="preserve"> </w:t>
       </w:r>
       <w:r>
-        <w:t xml:space="preserve">shows CWE-307 and CWE-400 among the highest-rate labels across conditions. Security-informed is relatively higher for CWE-400, CWE-770, and CWE-367, but lower for CWE-521, CWE-362, CWE-532, CWE-798, CWE-204, and CWE-209.</w:t>
+        <w:t xml:space="preserve">shows CWE-307 and CWE-400 among the highest rates across conditions, with Security-informed especially prominent for CWE-400 and CWE-367. Security-informed is comparatively low for CWE-521, CWE-362, CWE-532, and CWE-209, and has no bars for CWE-798 or CWE-204.</w:t>
       </w:r>
     </w:p>
     <w:bookmarkEnd w:id="59"/>
@@ -5404,7 +5401,7 @@
         </w:r>
       </w:hyperlink>
       <w:r>
-        <w:t xml:space="preserve">, CWE-307 rates are similar across conditions at 0.48, 0.48, and 0.5, while CWE-400 rises to 0.5 in Security-informed from 0.35 in Basic and 0.31 in Security-aware. Security-informed reports 0.0 for CWE-798 and CWE-204, and its Other rate of 3.12 is the table’s largest Other value.</w:t>
+        <w:t xml:space="preserve">, CWE-307 is reported at 0.48, 0.48, and 0.5 findings per review for Basic, Security-aware, and Security-informed, while CWE-400 is reported at 0.35, 0.31, and 0.5. The Other group is the largest row in every condition at 2.77, 3.06, and 3.12.</w:t>
       </w:r>
     </w:p>
     <w:bookmarkEnd w:id="61"/>
@@ -5512,7 +5509,7 @@
         <w:t xml:space="preserve"> </w:t>
       </w:r>
       <w:r>
-        <w:t xml:space="preserve">shows A07 as the highest mapped OWASP-category rate in all three conditions, while the unmapped group is higher still for Security-aware and Security-informed. A04 and A05 rise from Basic to Security-informed, whereas A01, A02, A06, A07, and A08 decline.</w:t>
+        <w:t xml:space="preserve">shows that unmapped CWEs and A07 have the highest findings-per-review rates in all three conditions. A07 declines from Basic through Security-informed, while A04 rises and the remaining mapped categories are much smaller.</w:t>
       </w:r>
     </w:p>
     <w:bookmarkEnd w:id="66"/>
@@ -6240,7 +6237,7 @@
         </w:r>
       </w:hyperlink>
       <w:r>
-        <w:t xml:space="preserve">, A07 is the highest mapped category in every condition, at 1.75 for Basic, 1.38 for Security-aware, and 1.04 for Security-informed. The unmapped rate is 1.48, 1.92, and 1.92 respectively; A04 rises from 0.52 to 0.69 to 0.79, while A03 is 0.02, 0.0, and 0.0.</w:t>
+        <w:t xml:space="preserve">, the unmapped group is largest at 1.48 findings per review for Basic and 1.92 for both Security-aware and Security-informed. A07 declines from 1.75 to 1.38 to 1.04, whereas A04 rises from 0.52 to 0.69 to 0.79.</w:t>
       </w:r>
     </w:p>
     <w:bookmarkEnd w:id="68"/>
@@ -6348,7 +6345,7 @@
         <w:t xml:space="preserve"> </w:t>
       </w:r>
       <w:r>
-        <w:t xml:space="preserve">shows that Other CWEs form the largest share in every condition and are most prominent in Security-informed. Among the named labels, Security-informed has visibly larger shares for CWE-400 and CWE-367 and a smaller share for CWE-521 than the other conditions.</w:t>
+        <w:t xml:space="preserve">shows that the Other CWE group takes the largest share in every condition and is most prominent for Security-informed. Among the named CWEs, the mix shifts toward CWE-307, CWE-400, and CWE-367 in Security-informed, while several categories visible in Basic and Security-aware are absent or smaller.</w:t>
       </w:r>
     </w:p>
     <w:bookmarkEnd w:id="73"/>
@@ -6445,7 +6442,7 @@
         <w:pStyle w:val="BodyText"/>
       </w:pPr>
       <w:r>
-        <w:t xml:space="preserve">The unmapped group is the largest segment under Security-aware and Security-informed in</w:t>
+        <w:t xml:space="preserve">The unmapped group is the largest share for Security-aware and Security-informed in</w:t>
       </w:r>
       <w:r>
         <w:t xml:space="preserve"> </w:t>
@@ -6459,7 +6456,7 @@
         </w:r>
       </w:hyperlink>
       <w:r>
-        <w:t xml:space="preserve">, while A07 is the largest mapped segment in every condition. Security-informed shows a larger A04 share and smaller A01, A06, and A07 shares than Basic.</w:t>
+        <w:t xml:space="preserve">, while A07 is the largest mapped category in every condition. Security-informed has a larger A04 share and smaller A07 and A01 shares than Basic.</w:t>
       </w:r>
     </w:p>
     <w:bookmarkEnd w:id="78"/>
@@ -6567,7 +6564,7 @@
         <w:t xml:space="preserve"> </w:t>
       </w:r>
       <w:r>
-        <w:t xml:space="preserve">shows substantial variation in CWE composition by generator and condition. Other CWEs dominate most panels, while codex’s Security-informed panel is concentrated in CWE-307 and agy’s corresponding panel gives greater prominence to CWE-400.</w:t>
+        <w:t xml:space="preserve">shows substantial variation in CWE composition by generator and condition. The Other group dominates most panels, while codex’s Security-informed findings are concentrated in fewer named CWEs and qwen retains a broad, Other-heavy mix.</w:t>
       </w:r>
     </w:p>
     <w:bookmarkEnd w:id="83"/>
@@ -6675,7 +6672,7 @@
         <w:t xml:space="preserve"> </w:t>
       </w:r>
       <w:r>
-        <w:t xml:space="preserve">shows that A07 or the unmapped group is the largest segment in most generator–condition panels. A07 is especially prominent for codex under Security-informed, while the unmapped share is largest for agy and qwen in that condition.</w:t>
+        <w:t xml:space="preserve">shows that the OWASP-category mix varies across both generators and conditions. A07 is especially prominent in several Basic panels, while the unmapped group is the largest slice in many Security-aware and Security-informed panels.</w:t>
       </w:r>
     </w:p>
     <w:bookmarkEnd w:id="88"/>
@@ -6783,7 +6780,7 @@
         <w:t xml:space="preserve"> </w:t>
       </w:r>
       <w:r>
-        <w:t xml:space="preserve">shows Sensitive data as the highest-rate rule group under all conditions. Security-informed is lower for Secrets, Authentication and access, and Failure behaviour, but higher for Trust boundaries, Concurrency, and No rule.</w:t>
+        <w:t xml:space="preserve">shows Sensitive data as the highest-rate rule group under all three conditions. Security-informed is lower for Secrets, Authentication and access, Failure behaviour, and Prefer the platform, but higher for Trust boundaries, Concurrency, and No rule.</w:t>
       </w:r>
     </w:p>
     <w:bookmarkEnd w:id="93"/>
@@ -7389,7 +7386,7 @@
         <w:pStyle w:val="BodyText"/>
       </w:pPr>
       <w:r>
-        <w:t xml:space="preserve">Sensitive data has the highest rate in every condition in</w:t>
+        <w:t xml:space="preserve">Sensitive data has the highest rate in</w:t>
       </w:r>
       <w:r>
         <w:t xml:space="preserve"> </w:t>
@@ -7403,7 +7400,10 @@
         </w:r>
       </w:hyperlink>
       <w:r>
-        <w:t xml:space="preserve">: 1.58 for Basic, 1.77 for Security-aware, and 1.75 for Security-informed. Security-informed is lowest for Secrets at 0.17 and highest for No rule at 0.92; Authentication and access declines from 1.25 to 1.1 to 0.88.</w:t>
+        <w:t xml:space="preserve"> </w:t>
+      </w:r>
+      <w:r>
+        <w:t xml:space="preserve">at 1.58 for Basic, 1.77 for Security-aware, and 1.75 for Security-informed. Security-informed is lowest for Secrets at 0.17 and highest for No rule at 0.92, compared with 0.54 for Basic and 0.73 for Security-aware.</w:t>
       </w:r>
     </w:p>
     <w:bookmarkEnd w:id="95"/>
@@ -7499,12 +7499,6 @@
       <w:pPr>
         <w:pStyle w:val="BodyText"/>
       </w:pPr>
-      <w:r>
-        <w:t xml:space="preserve">Sensitive data is the largest rule share in every condition in</w:t>
-      </w:r>
-      <w:r>
-        <w:t xml:space="preserve"> </w:t>
-      </w:r>
       <w:hyperlink w:anchor="fig-rule-mix">
         <w:r>
           <w:rPr>
@@ -7514,7 +7508,10 @@
         </w:r>
       </w:hyperlink>
       <w:r>
-        <w:t xml:space="preserve">. Security-informed assigns visibly smaller shares to Secrets and Failure behaviour and larger shares to Trust boundaries, Concurrency, and No rule than the other conditions.</w:t>
+        <w:t xml:space="preserve"> </w:t>
+      </w:r>
+      <w:r>
+        <w:t xml:space="preserve">shows Sensitive data as the largest share in every condition. Security-informed assigns larger shares to Trust boundaries, Identifiers and tokens, Concurrency, and No rule, while Secrets and Failure behaviour occupy smaller shares.</w:t>
       </w:r>
     </w:p>
     <w:bookmarkEnd w:id="100"/>
@@ -7622,7 +7619,7 @@
         <w:t xml:space="preserve"> </w:t>
       </w:r>
       <w:r>
-        <w:t xml:space="preserve">shows that all reviewers report more findings on agy-generated programs than on codex-generated programs. Relative to each reviewer’s own mean, agy is above average for every reviewer, while codex is below average for every reviewer and especially low in codex and qwen reviews.</w:t>
+        <w:t xml:space="preserve">shows strong reviewer and generator effects: every reviewer reports more findings on agy-generated code than on codex-generated code. Claude and qwen are the higher-volume reviewers overall, and codex’s self-review cell is notably low relative to its reviews of other generators.</w:t>
       </w:r>
     </w:p>
     <w:bookmarkEnd w:id="105"/>
@@ -8223,7 +8220,7 @@
         <w:pStyle w:val="BodyText"/>
       </w:pPr>
       <w:r>
-        <w:t xml:space="preserve">Claude reported the most findings per review in</w:t>
+        <w:t xml:space="preserve">In</w:t>
       </w:r>
       <w:r>
         <w:t xml:space="preserve"> </w:t>
@@ -8237,10 +8234,7 @@
         </w:r>
       </w:hyperlink>
       <w:r>
-        <w:t xml:space="preserve"> </w:t>
-      </w:r>
-      <w:r>
-        <w:t xml:space="preserve">at 7.83, while agy reported the highest High/Critical share at 29.31% and qwen the most distinct CWEs at 68. Codex showed the largest own-code contrast: 2.0 findings per review on own code versus 6.39 on other code, an other-minus-own difference of 4.39.</w:t>
+        <w:t xml:space="preserve">, claude reports the most findings per review at 7.83 and agy the fewest at 4.83; agy has the highest High/Critical share at 29.31%. Codex shows the largest own-code contrast, with 2.0 findings per review on its own code versus 6.39 on other code, an other-minus-own difference of 4.39.</w:t>
       </w:r>
     </w:p>
     <w:bookmarkEnd w:id="107"/>
@@ -8348,7 +8342,7 @@
         <w:t xml:space="preserve"> </w:t>
       </w:r>
       <w:r>
-        <w:t xml:space="preserve">separates reviewer volume from severity: claude has the highest finding volume but the lowest High/Critical share, while agy shows the reverse pattern. Agy and claude report fewer findings on other generators’ code than on their own, whereas codex and qwen report more.</w:t>
+        <w:t xml:space="preserve">separates reviewer volume from severity: agy has the highest High/Critical share despite the lowest finding volume, while claude has the highest volume and lowest High/Critical share. Codex reports far more findings on other generators’ code than on its own, whereas agy shows the reverse pattern.</w:t>
       </w:r>
     </w:p>
     <w:bookmarkEnd w:id="112"/>
@@ -8456,7 +8450,7 @@
         <w:t xml:space="preserve"> </w:t>
       </w:r>
       <w:r>
-        <w:t xml:space="preserve">shows distinct severity mixes by reviewer. Agy has the largest High share, codex is dominated by Medium findings, claude has the largest Low share, and qwen alone has a clearly visible Other segment.</w:t>
+        <w:t xml:space="preserve">shows distinct severity profiles: agy has the largest High share, claude is dominated by Low findings, and codex is dominated by Medium findings. Qwen has a more even split among Low, Medium, and High, plus a small Other segment.</w:t>
       </w:r>
     </w:p>
     <w:bookmarkEnd w:id="117"/>
@@ -8564,7 +8558,7 @@
         <w:t xml:space="preserve"> </w:t>
       </w:r>
       <w:r>
-        <w:t xml:space="preserve">shows that CWE labels are most often named by only one reviewer on a program, with progressively fewer pairs shared by additional reviewers. OWASP-category agreement is broader: naming by two reviewers is most common, and three- and four-reviewer agreement is more visible than for CWE labels.</w:t>
+        <w:t xml:space="preserve">shows that most CWE labels are named by only one reviewer on a program, with progressively fewer shared by additional reviewers. OWASP categories show broader agreement, with pairs named by two reviewers slightly more common than those named by one.</w:t>
       </w:r>
     </w:p>
     <w:bookmarkEnd w:id="122"/>
@@ -8887,7 +8881,7 @@
         </w:r>
       </w:hyperlink>
       <w:r>
-        <w:t xml:space="preserve">, 64.3% of 387 pairs were named by 1 reviewer, 27.1% by 2, 7.2% by 3, and 1.3% by all 4. For the 137 OWASP-category pairs, the corresponding shares were 32.1%, 35.8%, 21.2%, and 10.9%.</w:t>
+        <w:t xml:space="preserve">, 64.3% of 387 pairs are named by 1 reviewer and 1.3% by all 4. At the OWASP-category level, the corresponding shares among 137 pairs are 32.1% and 10.9%, with 35.8% named by 2 reviewers.</w:t>
       </w:r>
     </w:p>
     <w:bookmarkEnd w:id="124"/>
@@ -9238,6 +9232,12 @@
       <w:pPr>
         <w:pStyle w:val="BodyText"/>
       </w:pPr>
+      <w:r>
+        <w:t xml:space="preserve">Mean CWE Jaccard overlap in</w:t>
+      </w:r>
+      <w:r>
+        <w:t xml:space="preserve"> </w:t>
+      </w:r>
       <w:hyperlink w:anchor="tbl-jaccard">
         <w:r>
           <w:rPr>
@@ -9250,7 +9250,7 @@
         <w:t xml:space="preserve"> </w:t>
       </w:r>
       <w:r>
-        <w:t xml:space="preserve">reports low mean pairwise overlap at the CWE level, ranging from 0.1 for agy / qwen to 0.22 for claude / codex. OWASP overlap is higher for every pair, led by claude / qwen at 0.54 and lowest for agy / codex at 0.26.</w:t>
+        <w:t xml:space="preserve">ranges from 0.1 for agy / qwen to 0.22 for claude / codex. OWASP overlap is higher for every pair, ranging from 0.26 for agy / codex to 0.54 for claude / qwen.</w:t>
       </w:r>
     </w:p>
     <w:bookmarkEnd w:id="126"/>
@@ -9358,7 +9358,7 @@
         <w:t xml:space="preserve"> </w:t>
       </w:r>
       <w:r>
-        <w:t xml:space="preserve">shows that external-review CWE mixes are generally more dispersed than self-review mixes. The largest named external-review label differs by generator: CWE-770 for agy, CWE-367 for claude, CWE-307 for codex, and CWE-400 for qwen.</w:t>
+        <w:t xml:space="preserve">shows that Security-informed self-review and external review produce different CWE mixes for each generator. External reviews generally spread findings across more named CWEs; codex external reviews are much more Other-heavy than its concentrated self-review, while qwen retains CWE-400 as a prominent named category.</w:t>
       </w:r>
     </w:p>
     <w:bookmarkEnd w:id="131"/>
@@ -9454,12 +9454,6 @@
       <w:pPr>
         <w:pStyle w:val="BodyText"/>
       </w:pPr>
-      <w:r>
-        <w:t xml:space="preserve">In</w:t>
-      </w:r>
-      <w:r>
-        <w:t xml:space="preserve"> </w:t>
-      </w:r>
       <w:hyperlink w:anchor="fig-owasp-pies-2">
         <w:r>
           <w:rPr>
@@ -9469,7 +9463,10 @@
         </w:r>
       </w:hyperlink>
       <w:r>
-        <w:t xml:space="preserve">, the unmapped group is the largest segment for every generator’s external reviews. Compared with self-review, external reviews are less concentrated in A07 for codex and show a larger A06 share for agy and qwen.</w:t>
+        <w:t xml:space="preserve"> </w:t>
+      </w:r>
+      <w:r>
+        <w:t xml:space="preserve">shows the unmapped group as the largest category for most self-review and external-review panels. External review broadens the mix for codex and shifts qwen toward A06, while agy and claude retain sizable A01, A07, and unmapped portions.</w:t>
       </w:r>
     </w:p>
     <w:bookmarkEnd w:id="136"/>
@@ -9577,7 +9574,7 @@
         <w:t xml:space="preserve"> </w:t>
       </w:r>
       <w:r>
-        <w:t xml:space="preserve">shows that the Other group is the largest rate for every task. Among named CWEs, CWE-307 is strongest on the tasks anchored to CWE-1004, CWE-256, CWE-307, and CWE-778, while CWE-732 reaches its highest rates on the tasks anchored to CWE-321 and CWE-778.</w:t>
+        <w:t xml:space="preserve">shows that CWE reporting varies substantially by task rather than following a single common profile. CWE-307 is concentrated in Tasks 4 through 6, while CWE-732, CWE-798, and CWE-204 are most prominent in the later tasks and the Other group is largest for Task 1.</w:t>
       </w:r>
     </w:p>
     <w:bookmarkEnd w:id="141"/>
@@ -9685,7 +9682,7 @@
         <w:t xml:space="preserve"> </w:t>
       </w:r>
       <w:r>
-        <w:t xml:space="preserve">shows the unmapped group as the highest rate for every task except the task anchored to CWE-1004, where A07 is highest. A07 is also the leading mapped category for most tasks, while A01 leads among mapped categories for the task anchored to CWE-321.</w:t>
+        <w:t xml:space="preserve">shows the unmapped group as the highest findings-per-review category for Tasks 2 through 6, while A07 is also prominent across most tasks. A01 is highest for Task 2, and A06 is comparatively prominent for Tasks 4 and 6.</w:t>
       </w:r>
     </w:p>
     <w:bookmarkEnd w:id="146"/>
@@ -10096,7 +10093,7 @@
         <w:t xml:space="preserve"> </w:t>
       </w:r>
       <w:r>
-        <w:t xml:space="preserve">records 1224 CSV rows, 1217 reviewer-reported findings, 192 reviews, and 120 generated programs, with 7 reviews reporting no findings. It also shows 0 rows missing reviewer or generator, 0 duplicate rows, 0 findings with no CWE, 8 findings with non-standard severity, and 0 repeated sec_id values within a review.</w:t>
+        <w:t xml:space="preserve">records 1,224 CSV rows containing 1,217 findings across 192 reviews and 120 generated programs, including 7 reviews with no findings. It reports 0 missing reviewer or generator values, 0 duplicate rows, 0 findings without a CWE, and 0 repeated sec_id values within a review; 8 findings have non-standard severity.</w:t>
       </w:r>
     </w:p>
     <w:bookmarkEnd w:id="148"/>

</xml_diff>

<commit_message>
Refactor n8n code nodes, verified by a full run through every workflow path
</commit_message>
<xml_diff>
--- a/report/docs/final_report_findings.docx
+++ b/report/docs/final_report_findings.docx
@@ -54,7 +54,7 @@
         </w:numPr>
       </w:pPr>
       <w:r>
-        <w:t xml:space="preserve">The report contains 1,217 reviewer-reported findings across 192 reviews of 120 generated programs; these are findings reported by LLM reviewers, not confirmed vulnerabilities.</w:t>
+        <w:t xml:space="preserve">Reviewers reported 1217 findings across 192 reviews of 120 generated programs; these are reviewer-reported findings, not confirmed vulnerabilities.</w:t>
       </w:r>
     </w:p>
     <w:p>
@@ -66,7 +66,7 @@
         </w:numPr>
       </w:pPr>
       <w:r>
-        <w:t xml:space="preserve">Self-reviews produced 300 findings for Basic, 315 for Security-aware, and 139 for Security-informed, with 6.25, 6.56, and 5.79 findings per review, respectively.</w:t>
+        <w:t xml:space="preserve">Basic and Security-aware self-reviews produced 300 and 315 findings, while Security-informed self-reviews produced 139 findings across 24 reviews; the corresponding findings per review were 6.25, 6.56, and 5.79.</w:t>
       </w:r>
     </w:p>
     <w:p>
@@ -78,7 +78,7 @@
         </w:numPr>
       </w:pPr>
       <w:r>
-        <w:t xml:space="preserve">In the 48 matched Basic and Security-aware self-review pairs, Security-aware had a mean delta of 0.31 findings, with 23 pairs reporting more, 18 fewer, and 7 tied.</w:t>
+        <w:t xml:space="preserve">In 48 matched Basic and Security-aware self-review pairs, the mean delta was 0.31 findings and the median delta was 0.0; 18 pairs had fewer findings, 23 had more, and 7 were ties.</w:t>
       </w:r>
     </w:p>
     <w:p>
@@ -90,7 +90,7 @@
         </w:numPr>
       </w:pPr>
       <w:r>
-        <w:t xml:space="preserve">Sensitive data was the largest Security-informed rule grouping, with 339 findings and 27.9% of all findings; Authentication and access followed with 207 and 17.0%.</w:t>
+        <w:t xml:space="preserve">Sensitive data was the largest Security-informed rule grouping with 339 findings (27.9%), followed by Authentication and access with 207 (17.0%).</w:t>
       </w:r>
     </w:p>
     <w:p>
@@ -102,7 +102,7 @@
         </w:numPr>
       </w:pPr>
       <w:r>
-        <w:t xml:space="preserve">CWE-307 was the most-reported CWE with 90 findings, while the 14 leading CWEs together accounted for 51.9% of all findings.</w:t>
+        <w:t xml:space="preserve">CWE-307 was the most-reported CWE with 90 findings (7.4%); the 14 most-reported CWEs together accounted for 51.9% of all findings.</w:t>
       </w:r>
     </w:p>
     <w:p>
@@ -114,7 +114,7 @@
         </w:numPr>
       </w:pPr>
       <w:r>
-        <w:t xml:space="preserve">Reviewer agreement was greater at the OWASP-category level than at the CWE-label level: 10.9% of OWASP pairs, versus 1.3% of CWE pairs, were named by all 4 reviewers.</w:t>
+        <w:t xml:space="preserve">Reviewer agreement was higher at the OWASP-category level than at the CWE-label level: 32.1% of OWASP pairs versus 64.3% of CWE pairs were named by only one reviewer.</w:t>
       </w:r>
     </w:p>
     <w:bookmarkEnd w:id="9"/>
@@ -721,7 +721,7 @@
         <w:pStyle w:val="BodyText"/>
       </w:pPr>
       <w:r>
-        <w:t xml:space="preserve">Among the eight rule groupings in</w:t>
+        <w:t xml:space="preserve">The largest rule grouping in</w:t>
       </w:r>
       <w:r>
         <w:t xml:space="preserve"> </w:t>
@@ -735,7 +735,10 @@
         </w:r>
       </w:hyperlink>
       <w:r>
-        <w:t xml:space="preserve">, Sensitive data is largest with 339 reviewer-reported findings (27.9%), followed by Authentication and access with 207 (17.0%). A further 159 findings (13.1%) are assigned to no rule.</w:t>
+        <w:t xml:space="preserve"> </w:t>
+      </w:r>
+      <w:r>
+        <w:t xml:space="preserve">is Sensitive data with 339 reviewer-reported findings (27.9%), followed by Authentication and access with 207 (17.0%). Findings assigned to no rule total 159 (13.1%), while Identifiers and tokens is the smallest named grouping with 60 (4.9%).</w:t>
       </w:r>
     </w:p>
     <w:bookmarkEnd w:id="11"/>
@@ -1135,7 +1138,7 @@
         <w:t xml:space="preserve"> </w:t>
       </w:r>
       <w:r>
-        <w:t xml:space="preserve">covers 120 programs and 192 reviews: 48 Basic self-reviews, 48 Security-aware self-reviews, and 24 Security-informed self-reviews plus 72 external reviews. These reviews yielded 300, 315, and 602 reviewer-reported findings, respectively, while 7 reviews had no findings.</w:t>
+        <w:t xml:space="preserve">contains 48 Basic programs and 48 Security-aware programs, each with 48 self-reviews, plus 24 Security-informed programs with 24 self-reviews and 72 external reviews. The conditions yielded 300, 315, and 602 reviewer-reported findings respectively, and 7 reviews in total had no findings.</w:t>
       </w:r>
     </w:p>
     <w:bookmarkEnd w:id="13"/>
@@ -1243,7 +1246,7 @@
         <w:t xml:space="preserve"> </w:t>
       </w:r>
       <w:r>
-        <w:t xml:space="preserve">shows uniform completed-review coverage across every task and generator within each condition. Security-informed has more completed reviews in each cell because it includes both self-review and external review.</w:t>
+        <w:t xml:space="preserve">shows uniform review completion across every task and generator within each condition. Basic and Security-aware have the same completion pattern, while Security-informed has more completed reviews in every cell.</w:t>
       </w:r>
     </w:p>
     <w:bookmarkEnd w:id="18"/>
@@ -2201,7 +2204,7 @@
         </w:r>
       </w:hyperlink>
       <w:r>
-        <w:t xml:space="preserve">, Security-aware averaged 6.56 findings against 6.25 for Basic, a mean delta of 0.31; 23 pairs had more findings, 18 fewer, and 7 tied. The generator-level mean delta was positive for agy (1.08), claude (0.25), and qwen (0.67), but negative for codex (-0.75).</w:t>
+        <w:t xml:space="preserve">, Basic averaged 6.25 findings and Security-aware averaged 6.56, for a mean delta of 0.31 and median delta of 0.0; 18 pairs had fewer findings, 23 had more, and 7 were ties. The generator-specific mean deltas were 1.08 for agy, 0.25 for claude, -0.75 for codex, and 0.67 for qwen.</w:t>
       </w:r>
     </w:p>
     <w:bookmarkEnd w:id="20"/>
@@ -2309,7 +2312,7 @@
         <w:t xml:space="preserve"> </w:t>
       </w:r>
       <w:r>
-        <w:t xml:space="preserve">shows mostly positive paired differences for agy, mostly negative differences for codex, and more mixed results for claude and qwen. The individual pairs vary substantially within every generator.</w:t>
+        <w:t xml:space="preserve">shows matched-pair differences on both sides of zero for every generator. The mean marker is positive for agy, claude, and qwen, and negative for codex, with qwen showing the widest visual spread.</w:t>
       </w:r>
     </w:p>
     <w:bookmarkEnd w:id="25"/>
@@ -2712,7 +2715,7 @@
         </w:r>
       </w:hyperlink>
       <w:r>
-        <w:t xml:space="preserve">, Security-aware has the highest findings per review at 6.56, compared with 6.25 for Basic and 5.79 for Security-informed. The median is 6.0 for Basic and 7.0 for both security conditions, while the High/Critical share is 16.67%, 17.78%, and 14.39%, respectively.</w:t>
+        <w:t xml:space="preserve">, Security-aware has the highest findings per review at 6.56, compared with 6.25 for Basic and 5.79 for Security-informed. The median is 6.0 for Basic and 7.0 for both other conditions, while the High/Critical share is 16.67%, 17.78%, and 14.39%, respectively.</w:t>
       </w:r>
     </w:p>
     <w:bookmarkEnd w:id="27"/>
@@ -2820,7 +2823,7 @@
         <w:t xml:space="preserve"> </w:t>
       </w:r>
       <w:r>
-        <w:t xml:space="preserve">shows broad, overlapping distributions of findings per self-review across all three conditions. Security-aware extends across the widest range, while Security-informed has fewer observations and a similarly broad spread.</w:t>
+        <w:t xml:space="preserve">shows broadly overlapping findings-per-review distributions across the three conditions. Security-aware has the broadest upper range, while Security-informed has a wider central box than Basic.</w:t>
       </w:r>
     </w:p>
     <w:bookmarkEnd w:id="32"/>
@@ -2928,7 +2931,7 @@
         <w:t xml:space="preserve"> </w:t>
       </w:r>
       <w:r>
-        <w:t xml:space="preserve">shows that the condition pattern differs by generator: qwen is highest under Basic and Security-aware, whereas claude is highest under Security-informed. Codex is lowest in every condition and declines across the three conditions.</w:t>
+        <w:t xml:space="preserve">shows distinct condition patterns by generator: Security-aware is highest for agy and qwen, Security-informed is highest for claude, and Basic is highest for codex. Codex declines across the conditions, whereas claude rises most strongly under Security-informed.</w:t>
       </w:r>
     </w:p>
     <w:bookmarkEnd w:id="37"/>
@@ -3036,7 +3039,7 @@
         <w:t xml:space="preserve"> </w:t>
       </w:r>
       <w:r>
-        <w:t xml:space="preserve">shows marked task differences: Tasks 5 and 6 are highest under Basic and Security-aware, while Security-informed is highest for Task 3. Security-informed is lower than both other conditions on Tasks 1, 5, and 6, but higher on Tasks 2 and 3.</w:t>
+        <w:t xml:space="preserve">shows that task-level findings per self-review differ by condition. Basic and Security-aware are highest on Task 6, while Security-informed is highest on Task 3 and lower on Tasks 1, 5, and 6 than the other conditions.</w:t>
       </w:r>
     </w:p>
     <w:bookmarkEnd w:id="42"/>
@@ -3132,12 +3135,6 @@
       <w:pPr>
         <w:pStyle w:val="BodyText"/>
       </w:pPr>
-      <w:r>
-        <w:t xml:space="preserve">Low and Medium findings make up most reviewer-reported findings in every condition in</w:t>
-      </w:r>
-      <w:r>
-        <w:t xml:space="preserve"> </w:t>
-      </w:r>
       <w:hyperlink w:anchor="fig-severity">
         <w:r>
           <w:rPr>
@@ -3147,7 +3144,10 @@
         </w:r>
       </w:hyperlink>
       <w:r>
-        <w:t xml:space="preserve">. Security-informed has the largest Low share and the smallest High/Critical share, while Critical and Other findings occupy only small portions of the bars.</w:t>
+        <w:t xml:space="preserve"> </w:t>
+      </w:r>
+      <w:r>
+        <w:t xml:space="preserve">shows that Medium and Low findings make up most reviewer-reported findings in every condition. Security-aware has the largest High share, while Security-informed has the largest Low share and is the only condition with a visible Other segment.</w:t>
       </w:r>
     </w:p>
     <w:bookmarkEnd w:id="47"/>
@@ -3243,12 +3243,6 @@
       <w:pPr>
         <w:pStyle w:val="BodyText"/>
       </w:pPr>
-      <w:r>
-        <w:t xml:space="preserve">In</w:t>
-      </w:r>
-      <w:r>
-        <w:t xml:space="preserve"> </w:t>
-      </w:r>
       <w:hyperlink w:anchor="fig-anchor">
         <w:r>
           <w:rPr>
@@ -3258,7 +3252,10 @@
         </w:r>
       </w:hyperlink>
       <w:r>
-        <w:t xml:space="preserve">, reviewers name the task’s anchor CWE only for Tasks 5 and 6; none of the self-reviews name the anchor for Tasks 1 through 4. Task 5 is named most often under Basic, while Task 6 is named less often and varies less across conditions.</w:t>
+        <w:t xml:space="preserve"> </w:t>
+      </w:r>
+      <w:r>
+        <w:t xml:space="preserve">shows that the task’s anchor CWE was named only for Tasks 5 and 6. Task 5 has the highest anchor-CWE naming rate in every condition, while the conditions are closer together on Task 6.</w:t>
       </w:r>
     </w:p>
     <w:bookmarkEnd w:id="52"/>
@@ -4348,7 +4345,7 @@
         <w:t xml:space="preserve"> </w:t>
       </w:r>
       <w:r>
-        <w:t xml:space="preserve">ranks CWE-307 first with 90 reviewer-reported findings, followed by CWE-400 with 82 and CWE-916 with 58. The 14 listed CWEs account cumulatively for 51.9% of all findings.</w:t>
+        <w:t xml:space="preserve">ranks CWE-307 first with 90 reviewer-reported findings (7.4%), followed by CWE-400 with 82; CWE-916 is third with 58. The listed 14 CWEs account cumulatively for 51.9% of all findings.</w:t>
       </w:r>
     </w:p>
     <w:bookmarkEnd w:id="54"/>
@@ -4456,7 +4453,7 @@
         <w:t xml:space="preserve"> </w:t>
       </w:r>
       <w:r>
-        <w:t xml:space="preserve">shows CWE-307 and CWE-400 among the highest rates across conditions, with Security-informed especially prominent for CWE-400 and CWE-367. Security-informed is comparatively low for CWE-521, CWE-362, CWE-532, and CWE-209, and has no bars for CWE-798 or CWE-204.</w:t>
+        <w:t xml:space="preserve">shows that the leading CWE rates vary across conditions. CWE-307 is consistently prominent; Security-informed is comparatively higher for CWE-400, CWE-770, and CWE-367, but has no visible bars for CWE-798 or CWE-204.</w:t>
       </w:r>
     </w:p>
     <w:bookmarkEnd w:id="59"/>
@@ -5401,7 +5398,7 @@
         </w:r>
       </w:hyperlink>
       <w:r>
-        <w:t xml:space="preserve">, CWE-307 is reported at 0.48, 0.48, and 0.5 findings per review for Basic, Security-aware, and Security-informed, while CWE-400 is reported at 0.35, 0.31, and 0.5. The Other group is the largest row in every condition at 2.77, 3.06, and 3.12.</w:t>
+        <w:t xml:space="preserve">, CWE-307 is similar across conditions at 0.48, 0.48, and 0.5 findings per review, while CWE-400 rises from 0.35 and 0.31 to 0.5 in Security-informed. Security-informed is also highest for CWE-770 at 0.21 and CWE-367 at 0.29, whereas CWE-798 and CWE-204 are both 0.0.</w:t>
       </w:r>
     </w:p>
     <w:bookmarkEnd w:id="61"/>
@@ -5509,7 +5506,7 @@
         <w:t xml:space="preserve"> </w:t>
       </w:r>
       <w:r>
-        <w:t xml:space="preserve">shows that unmapped CWEs and A07 have the highest findings-per-review rates in all three conditions. A07 declines from Basic through Security-informed, while A04 rises and the remaining mapped categories are much smaller.</w:t>
+        <w:t xml:space="preserve">shows A07 as the largest mapped OWASP category in each condition, though its rate declines from Basic through Security-informed. Unmapped CWEs form the largest overall bar for Security-aware and Security-informed, and A04 increases across the three conditions.</w:t>
       </w:r>
     </w:p>
     <w:bookmarkEnd w:id="66"/>
@@ -6222,12 +6219,6 @@
       <w:pPr>
         <w:pStyle w:val="BodyText"/>
       </w:pPr>
-      <w:r>
-        <w:t xml:space="preserve">In</w:t>
-      </w:r>
-      <w:r>
-        <w:t xml:space="preserve"> </w:t>
-      </w:r>
       <w:hyperlink w:anchor="tbl-owasp-rates">
         <w:r>
           <w:rPr>
@@ -6237,7 +6228,10 @@
         </w:r>
       </w:hyperlink>
       <w:r>
-        <w:t xml:space="preserve">, the unmapped group is largest at 1.48 findings per review for Basic and 1.92 for both Security-aware and Security-informed. A07 declines from 1.75 to 1.38 to 1.04, whereas A04 rises from 0.52 to 0.69 to 0.79.</w:t>
+        <w:t xml:space="preserve"> </w:t>
+      </w:r>
+      <w:r>
+        <w:t xml:space="preserve">shows A07 at 1.75, 1.38, and 1.04 findings per review across Basic, Security-aware, and Security-informed, respectively. A04 rises from 0.52 to 0.69 to 0.79, while unmapped CWEs rise from 1.48 to 1.92 and remain at 1.92.</w:t>
       </w:r>
     </w:p>
     <w:bookmarkEnd w:id="68"/>
@@ -6345,7 +6339,7 @@
         <w:t xml:space="preserve"> </w:t>
       </w:r>
       <w:r>
-        <w:t xml:space="preserve">shows that the Other CWE group takes the largest share in every condition and is most prominent for Security-informed. Among the named CWEs, the mix shifts toward CWE-307, CWE-400, and CWE-367 in Security-informed, while several categories visible in Basic and Security-aware are absent or smaller.</w:t>
+        <w:t xml:space="preserve">shows that the aggregated Other group is the largest share of findings in all three conditions and is largest in Security-informed. Among individually displayed CWEs, Security-informed places more emphasis on CWE-400, while Basic and Security-aware have more similar mixes.</w:t>
       </w:r>
     </w:p>
     <w:bookmarkEnd w:id="73"/>
@@ -6441,12 +6435,6 @@
       <w:pPr>
         <w:pStyle w:val="BodyText"/>
       </w:pPr>
-      <w:r>
-        <w:t xml:space="preserve">The unmapped group is the largest share for Security-aware and Security-informed in</w:t>
-      </w:r>
-      <w:r>
-        <w:t xml:space="preserve"> </w:t>
-      </w:r>
       <w:hyperlink w:anchor="fig-owasp-mix">
         <w:r>
           <w:rPr>
@@ -6456,7 +6444,10 @@
         </w:r>
       </w:hyperlink>
       <w:r>
-        <w:t xml:space="preserve">, while A07 is the largest mapped category in every condition. Security-informed has a larger A04 share and smaller A07 and A01 shares than Basic.</w:t>
+        <w:t xml:space="preserve"> </w:t>
+      </w:r>
+      <w:r>
+        <w:t xml:space="preserve">shows that A07 and unmapped CWEs occupy the largest portions of each condition’s findings. The A07 share decreases across the conditions, while the unmapped and A04 shares are larger in Security-informed than in Basic.</w:t>
       </w:r>
     </w:p>
     <w:bookmarkEnd w:id="78"/>
@@ -6564,7 +6555,7 @@
         <w:t xml:space="preserve"> </w:t>
       </w:r>
       <w:r>
-        <w:t xml:space="preserve">shows substantial variation in CWE composition by generator and condition. The Other group dominates most panels, while codex’s Security-informed findings are concentrated in fewer named CWEs and qwen retains a broad, Other-heavy mix.</w:t>
+        <w:t xml:space="preserve">shows substantial variation in CWE mix by generator and condition. Codex’s Security-informed self-review is concentrated in CWE-307 and a small set of other displayed CWEs, whereas most other panels are dominated by the aggregated Other segment.</w:t>
       </w:r>
     </w:p>
     <w:bookmarkEnd w:id="83"/>
@@ -6672,7 +6663,7 @@
         <w:t xml:space="preserve"> </w:t>
       </w:r>
       <w:r>
-        <w:t xml:space="preserve">shows that the OWASP-category mix varies across both generators and conditions. A07 is especially prominent in several Basic panels, while the unmapped group is the largest slice in many Security-aware and Security-informed panels.</w:t>
+        <w:t xml:space="preserve">shows that A07 is prominent for most generator-condition combinations, while unmapped CWEs dominate several Security-aware and Security-informed panels. The Security-informed codex panel is especially concentrated in A07, whereas qwen’s Security-informed panel is more broadly distributed across mapped categories and unmapped CWEs.</w:t>
       </w:r>
     </w:p>
     <w:bookmarkEnd w:id="88"/>
@@ -6780,7 +6771,7 @@
         <w:t xml:space="preserve"> </w:t>
       </w:r>
       <w:r>
-        <w:t xml:space="preserve">shows Sensitive data as the highest-rate rule group under all three conditions. Security-informed is lower for Secrets, Authentication and access, Failure behaviour, and Prefer the platform, but higher for Trust boundaries, Concurrency, and No rule.</w:t>
+        <w:t xml:space="preserve">shows Sensitive data as the highest-rate rule grouping for all three conditions. Security-informed is comparatively lower for Secrets, Authentication and access, and Failure behaviour, but higher for Trust boundaries, Concurrency, and No rule.</w:t>
       </w:r>
     </w:p>
     <w:bookmarkEnd w:id="93"/>
@@ -7386,7 +7377,7 @@
         <w:pStyle w:val="BodyText"/>
       </w:pPr>
       <w:r>
-        <w:t xml:space="preserve">Sensitive data has the highest rate in</w:t>
+        <w:t xml:space="preserve">In</w:t>
       </w:r>
       <w:r>
         <w:t xml:space="preserve"> </w:t>
@@ -7400,10 +7391,7 @@
         </w:r>
       </w:hyperlink>
       <w:r>
-        <w:t xml:space="preserve"> </w:t>
-      </w:r>
-      <w:r>
-        <w:t xml:space="preserve">at 1.58 for Basic, 1.77 for Security-aware, and 1.75 for Security-informed. Security-informed is lowest for Secrets at 0.17 and highest for No rule at 0.92, compared with 0.54 for Basic and 0.73 for Security-aware.</w:t>
+        <w:t xml:space="preserve">, Sensitive data has the highest findings-per-review value in all three conditions at 1.58, 1.77, and 1.75. Security-informed has the lowest Secrets value at 0.17 and the highest No rule value at 0.92, while Authentication and access declines from 1.25 to 1.1 to 0.88.</w:t>
       </w:r>
     </w:p>
     <w:bookmarkEnd w:id="95"/>
@@ -7511,7 +7499,7 @@
         <w:t xml:space="preserve"> </w:t>
       </w:r>
       <w:r>
-        <w:t xml:space="preserve">shows Sensitive data as the largest share in every condition. Security-informed assigns larger shares to Trust boundaries, Identifiers and tokens, Concurrency, and No rule, while Secrets and Failure behaviour occupy smaller shares.</w:t>
+        <w:t xml:space="preserve">shows Sensitive data as the largest rule share in every condition. Security-informed has visibly larger shares for Trust boundaries, Concurrency, and No rule, and a much smaller Secrets share than Basic or Security-aware.</w:t>
       </w:r>
     </w:p>
     <w:bookmarkEnd w:id="100"/>
@@ -7619,7 +7607,7 @@
         <w:t xml:space="preserve"> </w:t>
       </w:r>
       <w:r>
-        <w:t xml:space="preserve">shows strong reviewer and generator effects: every reviewer reports more findings on agy-generated code than on codex-generated code. Claude and qwen are the higher-volume reviewers overall, and codex’s self-review cell is notably low relative to its reviews of other generators.</w:t>
+        <w:t xml:space="preserve">shows that all four reviewers report more findings on agy-generated programs than on codex-generated programs. Agy, claude, and qwen report fewer findings on their own code than their row maximum, while codex’s own-code cell is the lowest value in the matrix.</w:t>
       </w:r>
     </w:p>
     <w:bookmarkEnd w:id="105"/>
@@ -8219,12 +8207,6 @@
       <w:pPr>
         <w:pStyle w:val="BodyText"/>
       </w:pPr>
-      <w:r>
-        <w:t xml:space="preserve">In</w:t>
-      </w:r>
-      <w:r>
-        <w:t xml:space="preserve"> </w:t>
-      </w:r>
       <w:hyperlink w:anchor="tbl-behaviour">
         <w:r>
           <w:rPr>
@@ -8234,7 +8216,10 @@
         </w:r>
       </w:hyperlink>
       <w:r>
-        <w:t xml:space="preserve">, claude reports the most findings per review at 7.83 and agy the fewest at 4.83; agy has the highest High/Critical share at 29.31%. Codex shows the largest own-code contrast, with 2.0 findings per review on its own code versus 6.39 on other code, an other-minus-own difference of 4.39.</w:t>
+        <w:t xml:space="preserve"> </w:t>
+      </w:r>
+      <w:r>
+        <w:t xml:space="preserve">shows claude with the highest findings per review at 7.83 and the most distinct CWEs at 60, while qwen names 68 distinct CWEs and averages 7.12 findings. Agy has the highest High/Critical share at 29.31%; codex shows the largest positive other-minus-own contrast at 4.39, while agy’s contrast is -2.44.</w:t>
       </w:r>
     </w:p>
     <w:bookmarkEnd w:id="107"/>
@@ -8342,7 +8327,7 @@
         <w:t xml:space="preserve"> </w:t>
       </w:r>
       <w:r>
-        <w:t xml:space="preserve">separates reviewer volume from severity: agy has the highest High/Critical share despite the lowest finding volume, while claude has the highest volume and lowest High/Critical share. Codex reports far more findings on other generators’ code than on its own, whereas agy shows the reverse pattern.</w:t>
+        <w:t xml:space="preserve">separates reviewer volume from severity: claude has the highest findings volume but the lowest High/Critical share, while agy has the lowest volume and highest High/Critical share. Codex reports substantially more findings on other generators’ code than on its own, whereas agy shows the opposite pattern.</w:t>
       </w:r>
     </w:p>
     <w:bookmarkEnd w:id="112"/>
@@ -8450,7 +8435,7 @@
         <w:t xml:space="preserve"> </w:t>
       </w:r>
       <w:r>
-        <w:t xml:space="preserve">shows distinct severity profiles: agy has the largest High share, claude is dominated by Low findings, and codex is dominated by Medium findings. Qwen has a more even split among Low, Medium, and High, plus a small Other segment.</w:t>
+        <w:t xml:space="preserve">shows distinct severity mixes across reviewers. Agy has the largest High share, codex is dominated by Medium findings, and claude has the largest Low share; only qwen has a clearly visible Other segment.</w:t>
       </w:r>
     </w:p>
     <w:bookmarkEnd w:id="117"/>
@@ -8558,7 +8543,7 @@
         <w:t xml:space="preserve"> </w:t>
       </w:r>
       <w:r>
-        <w:t xml:space="preserve">shows that most CWE labels are named by only one reviewer on a program, with progressively fewer shared by additional reviewers. OWASP categories show broader agreement, with pairs named by two reviewers slightly more common than those named by one.</w:t>
+        <w:t xml:space="preserve">shows that most CWE-label pairs are named by only one reviewer, with rapidly fewer pairs as the number of agreeing reviewers increases. OWASP-category agreement is more distributed across multiple reviewers, and its largest group is categories named by two reviewers.</w:t>
       </w:r>
     </w:p>
     <w:bookmarkEnd w:id="122"/>
@@ -8867,7 +8852,7 @@
         <w:pStyle w:val="BodyText"/>
       </w:pPr>
       <w:r>
-        <w:t xml:space="preserve">At the CWE-label level in</w:t>
+        <w:t xml:space="preserve">In</w:t>
       </w:r>
       <w:r>
         <w:t xml:space="preserve"> </w:t>
@@ -8881,7 +8866,7 @@
         </w:r>
       </w:hyperlink>
       <w:r>
-        <w:t xml:space="preserve">, 64.3% of 387 pairs are named by 1 reviewer and 1.3% by all 4. At the OWASP-category level, the corresponding shares among 137 pairs are 32.1% and 10.9%, with 35.8% named by 2 reviewers.</w:t>
+        <w:t xml:space="preserve">, 64.3% of 387 CWE-label pairs were named by one reviewer, compared with 32.1% of 137 OWASP-category pairs. Agreement by all four reviewers occurred for 1.3% of CWE-label pairs and 10.9% of OWASP-category pairs.</w:t>
       </w:r>
     </w:p>
     <w:bookmarkEnd w:id="124"/>
@@ -9232,12 +9217,6 @@
       <w:pPr>
         <w:pStyle w:val="BodyText"/>
       </w:pPr>
-      <w:r>
-        <w:t xml:space="preserve">Mean CWE Jaccard overlap in</w:t>
-      </w:r>
-      <w:r>
-        <w:t xml:space="preserve"> </w:t>
-      </w:r>
       <w:hyperlink w:anchor="tbl-jaccard">
         <w:r>
           <w:rPr>
@@ -9250,7 +9229,7 @@
         <w:t xml:space="preserve"> </w:t>
       </w:r>
       <w:r>
-        <w:t xml:space="preserve">ranges from 0.1 for agy / qwen to 0.22 for claude / codex. OWASP overlap is higher for every pair, ranging from 0.26 for agy / codex to 0.54 for claude / qwen.</w:t>
+        <w:t xml:space="preserve">shows low mean CWE overlap for every reviewer pair, ranging from 0.1 for agy / qwen to 0.22 for claude / codex. OWASP overlap is higher for every pair, led by claude / qwen at 0.54 and lowest for agy / codex at 0.26.</w:t>
       </w:r>
     </w:p>
     <w:bookmarkEnd w:id="126"/>
@@ -9358,7 +9337,7 @@
         <w:t xml:space="preserve"> </w:t>
       </w:r>
       <w:r>
-        <w:t xml:space="preserve">shows that Security-informed self-review and external review produce different CWE mixes for each generator. External reviews generally spread findings across more named CWEs; codex external reviews are much more Other-heavy than its concentrated self-review, while qwen retains CWE-400 as a prominent named category.</w:t>
+        <w:t xml:space="preserve">shows different CWE mixes between Security-informed self-review and external review for each generator. External reviews are generally more dispersed across the displayed CWEs, although codex external reviews have a particularly large aggregated Other segment.</w:t>
       </w:r>
     </w:p>
     <w:bookmarkEnd w:id="131"/>
@@ -9466,7 +9445,7 @@
         <w:t xml:space="preserve"> </w:t>
       </w:r>
       <w:r>
-        <w:t xml:space="preserve">shows the unmapped group as the largest category for most self-review and external-review panels. External review broadens the mix for codex and shifts qwen toward A06, while agy and claude retain sizable A01, A07, and unmapped portions.</w:t>
+        <w:t xml:space="preserve">shows unmapped CWEs as the largest category in most Security-informed self-review and external-review panels. Codex self-review is the exception, where A07 dominates, while the external-review mix is led by unmapped CWEs for every generator.</w:t>
       </w:r>
     </w:p>
     <w:bookmarkEnd w:id="136"/>
@@ -9574,7 +9553,7 @@
         <w:t xml:space="preserve"> </w:t>
       </w:r>
       <w:r>
-        <w:t xml:space="preserve">shows that CWE reporting varies substantially by task rather than following a single common profile. CWE-307 is concentrated in Tasks 4 through 6, while CWE-732, CWE-798, and CWE-204 are most prominent in the later tasks and the Other group is largest for Task 1.</w:t>
+        <w:t xml:space="preserve">shows that CWE profiles vary by task, with the aggregated Other group largest for every task. Among the displayed CWEs, CWE-307 is most prominent in later tasks, while CWE-732 and CWE-798 are especially prominent on Task 6.</w:t>
       </w:r>
     </w:p>
     <w:bookmarkEnd w:id="141"/>
@@ -9682,7 +9661,7 @@
         <w:t xml:space="preserve"> </w:t>
       </w:r>
       <w:r>
-        <w:t xml:space="preserve">shows the unmapped group as the highest findings-per-review category for Tasks 2 through 6, while A07 is also prominent across most tasks. A01 is highest for Task 2, and A06 is comparatively prominent for Tasks 4 and 6.</w:t>
+        <w:t xml:space="preserve">shows unmapped CWEs as the highest-rate grouping for Tasks 2 through 6, while A07 is highest on Task 1. A07 is also prominent on Tasks 4 through 6, and A03 is nearly absent across all tasks.</w:t>
       </w:r>
     </w:p>
     <w:bookmarkEnd w:id="146"/>
@@ -10093,7 +10072,7 @@
         <w:t xml:space="preserve"> </w:t>
       </w:r>
       <w:r>
-        <w:t xml:space="preserve">records 1,224 CSV rows containing 1,217 findings across 192 reviews and 120 generated programs, including 7 reviews with no findings. It reports 0 missing reviewer or generator values, 0 duplicate rows, 0 findings without a CWE, and 0 repeated sec_id values within a review; 8 findings have non-standard severity.</w:t>
+        <w:t xml:space="preserve">records 1224 CSV rows comprising 1217 reviewer-reported findings across 192 reviews and 120 generated programs, with 7 reviews having no findings. It reports 0 rows missing reviewer or generator, 0 duplicate rows, 0 findings with no CWE, 8 findings with non-standard severity, and 0 repeated sec_id values within a review.</w:t>
       </w:r>
     </w:p>
     <w:bookmarkEnd w:id="148"/>

</xml_diff>